<commit_message>
Refactor challenge slips and facilitator guide; update reporting scripts and add package.json for pptxgenjs dependency
</commit_message>
<xml_diff>
--- a/downloads/cps_prompt_sheet.docx
+++ b/downloads/cps_prompt_sheet.docx
@@ -24,12 +24,6 @@
         <w:gridCol w:w="34"/>
       </w:tblGrid>
       <w:tr>
-        <w:tblPrEx>
-          <w:tblCellMar>
-            <w:top w:w="0" w:type="dxa"/>
-            <w:bottom w:w="0" w:type="dxa"/>
-          </w:tblCellMar>
-        </w:tblPrEx>
         <w:trPr>
           <w:trHeight w:val="492"/>
         </w:trPr>
@@ -48,22 +42,12 @@
             <w:pPr>
               <w:jc w:val="center"/>
               <w:rPr>
-                <w:rFonts w:ascii="Aptos" w:eastAsia="DengXian" w:hAnsi="Aptos" w:hint="eastAsia"/>
+                <w:rFonts w:ascii="Aptos" w:eastAsia="DengXian" w:hAnsi="Aptos"/>
                 <w:sz w:val="24"/>
                 <w:szCs w:val="24"/>
                 <w:lang w:eastAsia="zh-CN"/>
               </w:rPr>
             </w:pPr>
-            <w:r>
-              <w:rPr>
-                <w:rFonts w:ascii="Microsoft JhengHei" w:eastAsia="Microsoft JhengHei" w:hAnsi="Microsoft JhengHei"/>
-                <w:b/>
-                <w:bCs/>
-                <w:sz w:val="28"/>
-                <w:szCs w:val="28"/>
-              </w:rPr>
-              <w:t xml:space="preserve"> </w:t>
-            </w:r>
             <w:r>
               <w:rPr>
                 <w:rFonts w:ascii="Microsoft JhengHei" w:eastAsia="Microsoft JhengHei" w:hAnsi="Microsoft JhengHei"/>
@@ -112,7 +96,7 @@
     <w:p>
       <w:pPr>
         <w:rPr>
-          <w:rFonts w:eastAsia="DengXian" w:hint="eastAsia"/>
+          <w:rFonts w:eastAsia="DengXian"/>
           <w:lang w:eastAsia="zh-CN"/>
         </w:rPr>
       </w:pPr>
@@ -138,12 +122,6 @@
         <w:gridCol w:w="10096"/>
       </w:tblGrid>
       <w:tr>
-        <w:tblPrEx>
-          <w:tblCellMar>
-            <w:top w:w="0" w:type="dxa"/>
-            <w:bottom w:w="0" w:type="dxa"/>
-          </w:tblCellMar>
-        </w:tblPrEx>
         <w:tc>
           <w:tcPr>
             <w:tcW w:w="5000" w:type="pct"/>
@@ -198,12 +176,6 @@
         </w:tc>
       </w:tr>
       <w:tr>
-        <w:tblPrEx>
-          <w:tblCellMar>
-            <w:top w:w="0" w:type="dxa"/>
-            <w:bottom w:w="0" w:type="dxa"/>
-          </w:tblCellMar>
-        </w:tblPrEx>
         <w:tc>
           <w:tcPr>
             <w:tcW w:w="5000" w:type="pct"/>
@@ -235,12 +207,6 @@
         </w:tc>
       </w:tr>
       <w:tr>
-        <w:tblPrEx>
-          <w:tblCellMar>
-            <w:top w:w="0" w:type="dxa"/>
-            <w:bottom w:w="0" w:type="dxa"/>
-          </w:tblCellMar>
-        </w:tblPrEx>
         <w:tc>
           <w:tcPr>
             <w:tcW w:w="5000" w:type="pct"/>
@@ -341,12 +307,6 @@
         </w:tc>
       </w:tr>
       <w:tr>
-        <w:tblPrEx>
-          <w:tblCellMar>
-            <w:top w:w="0" w:type="dxa"/>
-            <w:bottom w:w="0" w:type="dxa"/>
-          </w:tblCellMar>
-        </w:tblPrEx>
         <w:tc>
           <w:tcPr>
             <w:tcW w:w="5000" w:type="pct"/>
@@ -401,12 +361,6 @@
         </w:tc>
       </w:tr>
       <w:tr>
-        <w:tblPrEx>
-          <w:tblCellMar>
-            <w:top w:w="0" w:type="dxa"/>
-            <w:bottom w:w="0" w:type="dxa"/>
-          </w:tblCellMar>
-        </w:tblPrEx>
         <w:tc>
           <w:tcPr>
             <w:tcW w:w="5000" w:type="pct"/>
@@ -438,12 +392,6 @@
         </w:tc>
       </w:tr>
       <w:tr>
-        <w:tblPrEx>
-          <w:tblCellMar>
-            <w:top w:w="0" w:type="dxa"/>
-            <w:bottom w:w="0" w:type="dxa"/>
-          </w:tblCellMar>
-        </w:tblPrEx>
         <w:tc>
           <w:tcPr>
             <w:tcW w:w="5000" w:type="pct"/>
@@ -527,7 +475,7 @@
                 <w:numId w:val="8"/>
               </w:numPr>
               <w:rPr>
-                <w:rFonts w:ascii="Aptos" w:eastAsia="Microsoft JhengHei" w:hAnsi="Aptos" w:hint="eastAsia"/>
+                <w:rFonts w:ascii="Aptos" w:eastAsia="Microsoft JhengHei" w:hAnsi="Aptos"/>
                 <w:sz w:val="20"/>
                 <w:szCs w:val="20"/>
               </w:rPr>
@@ -544,12 +492,6 @@
         </w:tc>
       </w:tr>
       <w:tr>
-        <w:tblPrEx>
-          <w:tblCellMar>
-            <w:top w:w="0" w:type="dxa"/>
-            <w:bottom w:w="0" w:type="dxa"/>
-          </w:tblCellMar>
-        </w:tblPrEx>
         <w:tc>
           <w:tcPr>
             <w:tcW w:w="5000" w:type="pct"/>
@@ -604,12 +546,6 @@
         </w:tc>
       </w:tr>
       <w:tr>
-        <w:tblPrEx>
-          <w:tblCellMar>
-            <w:top w:w="0" w:type="dxa"/>
-            <w:bottom w:w="0" w:type="dxa"/>
-          </w:tblCellMar>
-        </w:tblPrEx>
         <w:tc>
           <w:tcPr>
             <w:tcW w:w="5000" w:type="pct"/>
@@ -641,12 +577,6 @@
         </w:tc>
       </w:tr>
       <w:tr>
-        <w:tblPrEx>
-          <w:tblCellMar>
-            <w:top w:w="0" w:type="dxa"/>
-            <w:bottom w:w="0" w:type="dxa"/>
-          </w:tblCellMar>
-        </w:tblPrEx>
         <w:tc>
           <w:tcPr>
             <w:tcW w:w="5000" w:type="pct"/>
@@ -730,7 +660,7 @@
                 <w:numId w:val="9"/>
               </w:numPr>
               <w:rPr>
-                <w:rFonts w:ascii="Aptos" w:eastAsia="Microsoft JhengHei" w:hAnsi="Aptos" w:hint="eastAsia"/>
+                <w:rFonts w:ascii="Aptos" w:eastAsia="Microsoft JhengHei" w:hAnsi="Aptos"/>
                 <w:sz w:val="20"/>
                 <w:szCs w:val="20"/>
               </w:rPr>
@@ -747,12 +677,6 @@
         </w:tc>
       </w:tr>
       <w:tr>
-        <w:tblPrEx>
-          <w:tblCellMar>
-            <w:top w:w="0" w:type="dxa"/>
-            <w:bottom w:w="0" w:type="dxa"/>
-          </w:tblCellMar>
-        </w:tblPrEx>
         <w:tc>
           <w:tcPr>
             <w:tcW w:w="5000" w:type="pct"/>
@@ -818,12 +742,6 @@
         </w:tc>
       </w:tr>
       <w:tr>
-        <w:tblPrEx>
-          <w:tblCellMar>
-            <w:top w:w="0" w:type="dxa"/>
-            <w:bottom w:w="0" w:type="dxa"/>
-          </w:tblCellMar>
-        </w:tblPrEx>
         <w:tc>
           <w:tcPr>
             <w:tcW w:w="5000" w:type="pct"/>
@@ -855,12 +773,6 @@
         </w:tc>
       </w:tr>
       <w:tr>
-        <w:tblPrEx>
-          <w:tblCellMar>
-            <w:top w:w="0" w:type="dxa"/>
-            <w:bottom w:w="0" w:type="dxa"/>
-          </w:tblCellMar>
-        </w:tblPrEx>
         <w:tc>
           <w:tcPr>
             <w:tcW w:w="5000" w:type="pct"/>
@@ -944,7 +856,7 @@
                 <w:numId w:val="10"/>
               </w:numPr>
               <w:rPr>
-                <w:rFonts w:ascii="Aptos" w:eastAsia="Microsoft JhengHei" w:hAnsi="Aptos" w:hint="eastAsia"/>
+                <w:rFonts w:ascii="Aptos" w:eastAsia="Microsoft JhengHei" w:hAnsi="Aptos"/>
                 <w:sz w:val="20"/>
                 <w:szCs w:val="20"/>
               </w:rPr>
@@ -961,12 +873,6 @@
         </w:tc>
       </w:tr>
       <w:tr>
-        <w:tblPrEx>
-          <w:tblCellMar>
-            <w:top w:w="0" w:type="dxa"/>
-            <w:bottom w:w="0" w:type="dxa"/>
-          </w:tblCellMar>
-        </w:tblPrEx>
         <w:tc>
           <w:tcPr>
             <w:tcW w:w="5000" w:type="pct"/>
@@ -1021,12 +927,6 @@
         </w:tc>
       </w:tr>
       <w:tr>
-        <w:tblPrEx>
-          <w:tblCellMar>
-            <w:top w:w="0" w:type="dxa"/>
-            <w:bottom w:w="0" w:type="dxa"/>
-          </w:tblCellMar>
-        </w:tblPrEx>
         <w:tc>
           <w:tcPr>
             <w:tcW w:w="5000" w:type="pct"/>
@@ -1058,12 +958,6 @@
         </w:tc>
       </w:tr>
       <w:tr>
-        <w:tblPrEx>
-          <w:tblCellMar>
-            <w:top w:w="0" w:type="dxa"/>
-            <w:bottom w:w="0" w:type="dxa"/>
-          </w:tblCellMar>
-        </w:tblPrEx>
         <w:tc>
           <w:tcPr>
             <w:tcW w:w="5000" w:type="pct"/>
@@ -1147,7 +1041,7 @@
                 <w:numId w:val="11"/>
               </w:numPr>
               <w:rPr>
-                <w:rFonts w:ascii="Aptos" w:eastAsia="Microsoft JhengHei" w:hAnsi="Aptos" w:hint="eastAsia"/>
+                <w:rFonts w:ascii="Aptos" w:eastAsia="Microsoft JhengHei" w:hAnsi="Aptos"/>
                 <w:sz w:val="20"/>
                 <w:szCs w:val="20"/>
               </w:rPr>

</xml_diff>